<commit_message>
Correct starter letter dates and addresses and verify printed QR codes
</commit_message>
<xml_diff>
--- a/public/templates/kingsvale-follow-up-letter-template.docx
+++ b/public/templates/kingsvale-follow-up-letter-template.docx
@@ -331,6 +331,16 @@
                 <w:sz w:val="19"/>
                 <w:szCs w:val="19"/>
               </w:rPr>
+              <w:t>{{county}}</w:t>
+            </w:r>
+          </w:p>
+          <w:p>
+            <w:r>
+              <w:rPr>
+                <w:color w:val="111111"/>
+                <w:sz w:val="19"/>
+                <w:szCs w:val="19"/>
+              </w:rPr>
               <w:t>{{postal_code}}</w:t>
             </w:r>
           </w:p>
@@ -445,7 +455,7 @@
                 <w:szCs w:val="19"/>
               </w:rPr>
               <w:br/>
-              <w:t>Tuesday 9</w:t>
+              <w:t>{{date}}</w:t>
             </w:r>
             <w:r>
               <w:rPr>
@@ -453,14 +463,14 @@
                 <w:szCs w:val="19"/>
                 <w:vertAlign w:val="superscript"/>
               </w:rPr>
-              <w:t>th</w:t>
+              <w:t/>
             </w:r>
             <w:r>
               <w:rPr>
                 <w:sz w:val="19"/>
                 <w:szCs w:val="19"/>
               </w:rPr>
-              <w:t xml:space="preserve"> June 2026</w:t>
+              <w:t xml:space="preserve"/>
             </w:r>
           </w:p>
         </w:tc>

</xml_diff>